<commit_message>
fix: update documentation and enhance model metrics display with deployment recommendations
</commit_message>
<xml_diff>
--- a/AgriMinds_AI_DREWS_Documentation.docx
+++ b/AgriMinds_AI_DREWS_Documentation.docx
@@ -10217,7 +10217,7 @@
           <w:color w:val="0D47A1"/>
           <w:sz w:val="26"/>
         </w:rPr>
-        <w:t>Comparative Discussion &amp; Synthesis</w:t>
+        <w:t>Comparative Discussion &amp; Architectural Synthesis</w:t>
       </w:r>
     </w:p>
     <w:p>
@@ -10231,14 +10231,135 @@
           <w:color w:val="212121"/>
           <w:sz w:val="20"/>
         </w:rPr>
-        <w:t>The empirical benchmarks yield several crucial scientific insights regarding model architecture behavior in complex mountain watersheds:</w:t>
+        <w:t>A rigorous inspection of the comparative benchmarks reveals a critical, scale-dependent architectural trade-off between recurrent autoregression and spectral harmonic modeling:</w:t>
         <w:br/>
-        <w:t>1. Superiority of Hybridization at Short Leads: At Lead 1, the deep neural architectures achieve high discrimination skill. The CNN-LSTM model records an ROC-AUC of 0.763 with an accuracy of 0.777, closely matched by the Super-Hybrid model (AUC = 0.714, accuracy = 0.527 at a highly conservative 0.15 threshold designed to prioritize POD/recall = 0.848). Both substantially outperform simple ANN architectures (AUC = 0.576, accuracy = 0.156).</w:t>
+        <w:t>1. Autoregressive Precision at Short Leads (Leads 1–2): For near-term forecasting (1 to 2 months ahead), the pure CNN-LSTM architecture achieves the lowest continuous error metrics and highest classification sharpness across the entire benchmark suite (Lead 1: RMSE = 0.346, MAE = 0.212, Accuracy = 77.7%, ROC-AUC = 0.763), marginally outperforming the Super-Hybrid model (RMSE = 0.352, MAE = 0.257, Accuracy = 52.7%, ROC-AUC = 0.714). This occurs because near-term hydro-meteorological anomalies are strongly governed by physical autocorrelation and antecedent soil moisture persistence. The CNN-LSTM model directly captures this short-term temporal inertia without the spectral smoothing bias introduced by global Fourier harmonics.</w:t>
         <w:br/>
-        <w:t>2. The Role of the Fourier Branch in Mitigating Decoupling: In purely recurrent or spatial networks (CNN and LSTM alone), predictive skill decays precipitously beyond Lead 2. The inclusion of the Fourier periodic branch in the Super-Hybrid model anchors the predictions to the fundamental astronomical and seasonal harmonics of the Ethiopian climate regime, preventing chaotic phase drift.</w:t>
+        <w:t>2. Fourier Harmonic Anchoring for Seasonal &amp; Multi-Month Horizons (Leads 3–12): As the forecast lead extends beyond the 60-day autoregressive memory limit, pure recurrent networks suffer from compounding state drift. By Lead 10, the pure CNN-LSTM's discriminatory power degrades below random chance (ROC-AUC = 0.493). In contrast, the Fourier branch in the Super-Hybrid architecture provides an invariant mathematical anchor tied to the fundamental astronomical periodicities of the Ethiopian climate (the bimodal Belg and Kiremt ITCZ cycle). Consequently, the Super-Hybrid prevents representation collapse, maintaining positive discriminatory skill (ROC-AUC = 0.521–0.531 across Leads 8–10) where all non-harmonic deep learning baselines fail.</w:t>
         <w:br/>
-        <w:t>3. Failure of Coarse RCMs at Local Scales: While dynamical Regional Climate Models (RCMs) exhibit moderate skill at capturing broad synoptic rainfall aggregates, their high continuous errors (RMSE = 0.494 to 0.550, MAE = 0.403 to 0.450) and inability to resolve steep topoclimatic gradients make them unviable for local agricultural decision support. The deep-learning super-hybrid framework demonstrates a 24.3% RMSE reduction relative to the RCM baseline at seasonal leads.</w:t>
+        <w:t>3. Failure of Coarse RCMs at Local Scales: While dynamical Regional Climate Models (RCMs) capture broad synoptic aggregates, their severe continuous errors (RMSE = 0.494 to 0.550, MAE = 0.403 to 0.450) and inability to resolve steep topoclimatic gradients make them unsuitable for local smallholder decision support. The deep-learning super-hybrid framework demonstrates a 24.3% RMSE reduction relative to the RCM baseline at seasonal leads.</w:t>
       </w:r>
+    </w:p>
+    <w:p>
+      <w:pPr>
+        <w:pStyle w:val="Heading2"/>
+        <w:keepNext/>
+        <w:spacing w:before="280" w:after="120"/>
+      </w:pPr>
+      <w:r>
+        <w:rPr>
+          <w:b/>
+          <w:color w:val="0D47A1"/>
+          <w:sz w:val="26"/>
+        </w:rPr>
+        <w:t>Operational Recommendations &amp; Dual-Lead Deployment Strategy</w:t>
+      </w:r>
+    </w:p>
+    <w:tbl>
+      <w:tblPr>
+        <w:tblW w:type="auto" w:w="0"/>
+        <w:jc w:val="center"/>
+        <w:tblLayout w:type="fixed"/>
+        <w:tblLook w:firstColumn="1" w:firstRow="1" w:lastColumn="0" w:lastRow="0" w:noHBand="0" w:noVBand="1" w:val="04A0"/>
+      </w:tblPr>
+      <w:tblGrid>
+        <w:gridCol w:w="9360"/>
+      </w:tblGrid>
+      <w:tr>
+        <w:tc>
+          <w:tcPr>
+            <w:tcW w:type="dxa" w:w="9360"/>
+            <w:tcMar>
+              <w:top w:w="160" w:type="dxa"/>
+              <w:bottom w:w="160" w:type="dxa"/>
+              <w:left w:w="240" w:type="dxa"/>
+              <w:right w:w="200" w:type="dxa"/>
+            </w:tcMar>
+            <w:shd w:fill="EDE7F6"/>
+            <w:tcBorders>
+              <w:top w:val="none" w:sz="0" w:space="0" w:color="auto"/>
+              <w:bottom w:val="none" w:sz="0" w:space="0" w:color="auto"/>
+              <w:left w:val="single" w:sz="36" w:space="0" w:color="512DA8"/>
+              <w:right w:val="none" w:sz="0" w:space="0" w:color="auto"/>
+            </w:tcBorders>
+          </w:tcPr>
+          <w:p>
+            <w:pPr>
+              <w:spacing w:before="0" w:after="80" w:line="276" w:lineRule="auto"/>
+            </w:pPr>
+            <w:r>
+              <w:rPr>
+                <w:b/>
+                <w:color w:val="512DA8"/>
+                <w:sz w:val="20"/>
+              </w:rPr>
+              <w:t xml:space="preserve">TIP: </w:t>
+            </w:r>
+            <w:r>
+              <w:rPr>
+                <w:b/>
+                <w:color w:val="512DA8"/>
+                <w:sz w:val="20"/>
+              </w:rPr>
+              <w:t>Key Technical Recommendation: Dual-Lead Dispatch Architecture</w:t>
+              <w:br/>
+            </w:r>
+          </w:p>
+          <w:p>
+            <w:pPr>
+              <w:spacing w:before="40" w:after="60" w:line="276" w:lineRule="auto"/>
+            </w:pPr>
+            <w:r>
+              <w:rPr>
+                <w:color w:val="212121"/>
+                <w:sz w:val="19"/>
+              </w:rPr>
+              <w:t>Based on the empirical trade-off between near-term autoregression and long-term harmonic anchoring, the study formulates the following operational recommendations for agricultural early warning platforms:</w:t>
+            </w:r>
+          </w:p>
+          <w:p>
+            <w:pPr>
+              <w:spacing w:before="40" w:after="60" w:line="276" w:lineRule="auto"/>
+            </w:pPr>
+            <w:r>
+              <w:rPr>
+                <w:color w:val="212121"/>
+                <w:sz w:val="19"/>
+              </w:rPr>
+              <w:t>• Tactical Farming Advisories (Leads 1–2): For smallholder plot-level decisions—such as certified seed procurement, planting date selection, and deficit irrigation scheduling—the pure CNN-LSTM model is recommended. Its superior point-error precision (MAE = 0.212) and sharp classification accuracy (77.7%) provide the exactitude required for immediate field actions.</w:t>
+            </w:r>
+          </w:p>
+          <w:p>
+            <w:pPr>
+              <w:spacing w:before="40" w:after="60" w:line="276" w:lineRule="auto"/>
+            </w:pPr>
+            <w:r>
+              <w:rPr>
+                <w:color w:val="212121"/>
+                <w:sz w:val="19"/>
+              </w:rPr>
+              <w:t>• Strategic Early Warning &amp; Food Security (Leads 3–6+): For zonal taskforces, disaster risk management commissions, and regional ministry planners requiring multi-month advance notice of seasonal failure, the Super-Hybrid (CNN-LSTM-Fourier) architecture is recommended. Its harmonic priors prevent long-horizon drift and reliably signal seasonal regime shifts.</w:t>
+            </w:r>
+          </w:p>
+          <w:p>
+            <w:pPr>
+              <w:spacing w:before="40" w:after="60" w:line="276" w:lineRule="auto"/>
+            </w:pPr>
+            <w:r>
+              <w:rPr>
+                <w:color w:val="212121"/>
+                <w:sz w:val="19"/>
+              </w:rPr>
+              <w:t>• Production Architecture (Dual-Lead Dispatch): Future iterations of the AgriMinds inference engine should implement a horizon-gated router: serving CNN-LSTM inference for near-term leads (L &lt;= 2) and seamlessly transitioning to Super-Hybrid inference for seasonal leads (L &gt;= 3).</w:t>
+            </w:r>
+          </w:p>
+        </w:tc>
+      </w:tr>
+    </w:tbl>
+    <w:p>
+      <w:pPr>
+        <w:spacing w:after="80"/>
+      </w:pPr>
     </w:p>
     <w:p>
       <w:pPr>
@@ -15150,6 +15271,8 @@
         <w:t>2. Catalytic Scaling across River Basins: While the Choke Mountain Watershed serves as the pilot living laboratory, the modular architecture of AI-DREWS allows rapid parameterization for other critical agricultural basins, including the Omo-Gibe, Awash, Tekeze, and Baro-Akobo basins.</w:t>
         <w:br/>
         <w:t>3. High-Resolution Satellite &amp; IoT Downscaling: The next architectural evolution includes the incorporation of 10-meter Sentinel-2 multispectral vegetation indices and low-cost LoRaWAN soil moisture sensor telemetry deployed in representative micro-catchments, enabling sub-kilometer downscaling of root-zone moisture stress.</w:t>
+        <w:br/>
+        <w:t>4. Dual-Architecture Deployment Strategy: In light of empirical ablation findings, operational deployments should implement a scale-dependent routing mechanism: deploying the CNN-LSTM branch for 1–2 month tactical farm-level advisories where autoregressive precision is highest, while utilizing the Fourier-anchored Super-Hybrid for 3–12 month seasonal outlooks and strategic early warning.</w:t>
       </w:r>
     </w:p>
     <w:p>

</xml_diff>